<commit_message>
SE Overview: update stale CrowdStrike gap counts (125 → 88)
Scenario A and Scenario E metrics corrected to match master sheet.
Keeping in sync with Fleet Reference doc (same change applied there earlier).

Co-Authored-By: Claude Sonnet 4.6 <noreply@anthropic.com>
</commit_message>
<xml_diff>
--- a/docs/Luminary_Systems_SE_Overview.docx
+++ b/docs/Luminary_Systems_SE_Overview.docx
@@ -1562,7 +1562,7 @@
           </w:tcPr>
           <w:p>
             <w:r>
-              <w:t xml:space="preserve">125</w:t>
+              <w:t>88</w:t>
             </w:r>
           </w:p>
         </w:tc>
@@ -2134,7 +2134,7 @@
           </w:tcPr>
           <w:p>
             <w:r>
-              <w:t xml:space="preserve">125</w:t>
+              <w:t>88</w:t>
             </w:r>
           </w:p>
         </w:tc>

</xml_diff>

<commit_message>
Update Meraki→1,047 and Mist→665 in SE Overview and Dataset Final
Co-Authored-By: Claude Sonnet 4.6 <noreply@anthropic.com>
</commit_message>
<xml_diff>
--- a/docs/Luminary_Systems_SE_Overview.docx
+++ b/docs/Luminary_Systems_SE_Overview.docx
@@ -593,7 +593,7 @@
           </w:tcPr>
           <w:p>
             <w:r>
-              <w:t>1,177</w:t>
+              <w:t>1,047</w:t>
             </w:r>
           </w:p>
         </w:tc>
@@ -625,7 +625,7 @@
           </w:tcPr>
           <w:p>
             <w:r>
-              <w:t>745</w:t>
+              <w:t>665</w:t>
             </w:r>
           </w:p>
         </w:tc>

</xml_diff>